<commit_message>
vault backup: 2026-03-27 20:38:31
</commit_message>
<xml_diff>
--- a/30_記事製造ライン/フルパッケージ/アンナチュラル_臨床検査技師_2026-03-27_v1.1.docx
+++ b/30_記事製造ライン/フルパッケージ/アンナチュラル_臨床検査技師_2026-03-27_v1.1.docx
@@ -58,10 +58,19 @@
         <w:t>## 誰にも気づかれない仕事が、誰かの命を繋いでいる</w:t>
         <w:br/>
         <w:br/>
-        <w:t>「東海林さん、結果まだですか？」——ドラマの中で何度も急かされる臨床検査技師の姿を見て、胸がざわついた人はいませんか？</w:t>
-        <w:br/>
-        <w:br/>
-        <w:t>僕は看護師を26年やっている。救急の現場で、何度も検査技師さんに助けられてきた。でもそのことを、患者さんが知ることはほぼない。医者の名前は覚えていても、検査結果を出してくれた人の名前なんて、誰も聞かない。アンナチュラルの東海林を見ていて、あの「報われなさ」がリアルすぎて、正直しんどかった。</w:t>
+        <w:t>「東海林さん、結果まだですか？」</w:t>
+        <w:br/>
+        <w:br/>
+        <w:t>ドラマの中で何度も急かされる臨床検査技師の姿を見て、胸がざわついた人はいませんか？</w:t>
+        <w:br/>
+        <w:br/>
+        <w:t>僕は看護師を26年やっている。救急の現場で、何度も検査技師さんに助けられてきた。夜中の3時に急変した患者のラボデータを、誰よりも早く叩き出してくれたのは、いつも検査室にひとりで残っていた技師さんだった。</w:t>
+        <w:br/>
+        <w:br/>
+        <w:t>でもそのことを、患者さんが知ることはほぼない。退院するとき、医者の名前は覚えていても、検査結果を出してくれた人の名前なんて、誰も聞かない。</w:t>
+        <w:br/>
+        <w:br/>
+        <w:t>アンナチュラルの東海林を見ていて、あの「報われなさ」がリアルすぎて、正直しんどかった。</w:t>
         <w:br/>
         <w:br/>
         <w:t>## 東海林夏来という"最強の2番手"</w:t>
@@ -70,13 +79,25 @@
         <w:t>東海林はUDIラボの臨床検査技師だ。法医解剖医のミコトが「答え」にたどり着くための、データをすべて揃える人間。血液検査、毒物分析、細胞の異常——彼女が出す数字がなければ、真実は永遠に闇の中だった。</w:t>
         <w:br/>
         <w:br/>
-        <w:t>でも東海林は「すごい」と言われるポジションじゃない。むしろ「まだ？」「早く」と急かされる側。これ、現実の医療現場でもまったく同じなんですよね。検査技師さんがいなかったら診断なんてできないのに、存在が透明になりがちな職種。僕はそれを「2番手の宿命」だと思っている。</w:t>
+        <w:t>でも東海林は「すごい」と言われるポジションじゃない。むしろ「まだ？」「早く」と急かされる側だ。</w:t>
+        <w:br/>
+        <w:br/>
+        <w:t>これ、現実の医療現場でもまったく同じなんですよね。</w:t>
+        <w:br/>
+        <w:br/>
+        <w:t>検査技師さんがいなかったら診断なんてできないのに、存在が透明になりがちな職種。僕はそれを「2番手の宿命」だと思っている。1番手が輝くための土台を作っているのに、土台は誰の目にも映らない。</w:t>
         <w:br/>
         <w:br/>
         <w:t>## 見えない仕事にこそ、アセスメントの本質がある</w:t>
         <w:br/>
         <w:br/>
-        <w:t>看護師の仕事もそうだけど、「見えない仕事」をしている人間は、自分の価値を疑いやすい。誰も褒めてくれないから。でも、アセスメントって本来そういうものなんですよね。患者の微妙な変化に気づいて、データを読んで、「これはまずい」と判断する。その判断は表に出ない。でも、それがなかったら人は死ぬ。</w:t>
+        <w:t>看護師の仕事もそうだけど、「見えない仕事」をしている人間は、自分の価値を疑いやすい。誰も褒めてくれないから。</w:t>
+        <w:br/>
+        <w:br/>
+        <w:t>でも、アセスメントって本来そういうものなんですよね。患者の微妙な変化に気づいて、データを読んで、「これはまずい」と判断する。その判断は表に出ない。でも、それがなかったら人は死ぬ。</w:t>
+        <w:br/>
+        <w:br/>
+        <w:t>夜勤中、検査技師さんから電話が来たことがある。「この数値、ちょっとおかしいんですけど」と。医師はまだ気づいていなかった。あの一本の電話がなかったら、患者さんの容態は確実に悪化していた。</w:t>
         <w:br/>
         <w:br/>
         <w:t>**見えない仕事をしている人間が、実は一番替えが効かない。**</w:t>
@@ -88,7 +109,19 @@
         <w:t>## 報われない場所で頑張り続ける必要は、ない</w:t>
         <w:br/>
         <w:br/>
-        <w:t>ただ、ひとつだけ。「見えない仕事」の価値に気づいてくれない環境にいるなら、そこにしがみつく理由はないと僕は思う。東海林はUDIラボという「仲間が見てくれる場所」にいたから輝けた。環境を選ぶことは逃げじゃない。自分の価値を正しく使える場所を探すことは、最高のアセスメントだと思いませんか。</w:t>
+        <w:t>ただ、ひとつだけ。</w:t>
+        <w:br/>
+        <w:br/>
+        <w:t>「見えない仕事」の価値に気づいてくれない環境にいるなら、そこにしがみつく理由はないと僕は思う。</w:t>
+        <w:br/>
+        <w:br/>
+        <w:t>東海林はUDIラボという「仲間が見てくれる場所」にいたから輝けた。六郎やミコトが東海林の仕事を理解していたから、彼女は報われない場所にいながらも腐らなかった。</w:t>
+        <w:br/>
+        <w:br/>
+        <w:t>でも現実は、見てくれる人がいない職場のほうが多い。</w:t>
+        <w:br/>
+        <w:br/>
+        <w:t>環境を選ぶことは逃げじゃない。自分の価値を正しく使える場所を探すことは、最高のアセスメントだと思いませんか。</w:t>
         <w:br/>
         <w:br/>
         <w:t>noteでは書ききれなかった、臨床検査技師の具体的な仕事内容やチーム医療の裏側については、ブログの方に詳しく置いておきました。</w:t>
@@ -231,7 +264,7 @@
     </w:p>
     <w:p>
       <w:r>
-        <w:t>A dramatic manga-style 4-panel comic layout in dark navy and white tones. Panel 1: A lone female lab technician in a white coat standing in a dark forensic laboratory, dramatic speed lines behind her, Japanese text "孤独な戦い" (A lonely fight). Panel 2: Close-up of her hands urgently carrying test results, motion blur effect, Japanese text "結果まだ？（早く出して！）" (Results yet? Rush!). Panel 3: She runs through a hospital corridor with dramatic impact effects, Japanese text "走って報告！" (Running to report!). Panel 4: Large bold Japanese text "2番手がいなければ、1番手は輝けない" (Without the second, the first cannot shine) with dramatic manga impact effects. Masterpiece, highly detailed, manga ink style, high contrast, dynamic composition. Aspect ratio 16:9</w:t>
+        <w:t>A cinematic and emotional anime style illustration. A female clinical laboratory technician in a white coat sits alone in a dark empty hospital laboratory at night, surrounded by glowing monitors and test equipment. She stares at a single test result paper in her hands with a quiet, exhausted but determined expression. Beside her, a faint translucent silhouette of a second person (symbolizing the invisible teammate) is barely visible. Dark navy and teal atmosphere, dramatic cinematic lighting from monitors casting blue glow on her face. Large bold Japanese text "見えない仕事が、命を繋いでいる" displayed prominently in the lower half of the image in white font with subtle shadow outline, easily readable. Masterpiece, highly detailed, cel-shaded, soft rim lighting, moody cinematic composition. Aspect ratio 16:9</w:t>
       </w:r>
     </w:p>
     <w:p>

</xml_diff>